<commit_message>
final editing, spelling corrections etc.
</commit_message>
<xml_diff>
--- a/Predicting Melanoma Patient Survival Outcomes Using Logistic Regression - Notebook Writeup.docx
+++ b/Predicting Melanoma Patient Survival Outcomes Using Logistic Regression - Notebook Writeup.docx
@@ -7,7 +7,13 @@
         <w:pStyle w:val="Heading1"/>
       </w:pPr>
       <w:r>
-        <w:t>Predicting Melanoma Patient Survival Outcomes Using Logistic Regression: A Classification Analysis of the Veneto Cancer Registry</w:t>
+        <w:t xml:space="preserve">Predicting Melanoma Patient Survival Outcomes Using Logistic Regression: A Classification Analysis of the Veneto </w:t>
+      </w:r>
+      <w:r>
+        <w:t>Tumour</w:t>
+      </w:r>
+      <w:r>
+        <w:t xml:space="preserve"> Registry</w:t>
       </w:r>
     </w:p>
     <w:p/>
@@ -45,7 +51,7 @@
     </w:p>
     <w:p>
       <w:r>
-        <w:t>The purpose of this notebook is to see if Logistical Regression can be used to predict survival of a patient (</w:t>
+        <w:t>The purpose of this notebook is to see if Logistic Regression can be used to predict survival of a patient (</w:t>
       </w:r>
       <w:proofErr w:type="gramStart"/>
       <w:r>
@@ -78,11 +84,9 @@
       <w:r>
         <w:t xml:space="preserve">Data is from the Vento </w:t>
       </w:r>
-      <w:proofErr w:type="spellStart"/>
-      <w:r>
-        <w:t>Tumor</w:t>
-      </w:r>
-      <w:proofErr w:type="spellEnd"/>
+      <w:r>
+        <w:t>Tumour</w:t>
+      </w:r>
       <w:r>
         <w:t xml:space="preserve"> Registry, details of which can be found in this repository in the Data_Description.md file.</w:t>
       </w:r>
@@ -98,7 +102,24 @@
     </w:p>
     <w:p>
       <w:r>
-        <w:t xml:space="preserve">This dataset was analysed using the </w:t>
+        <w:t xml:space="preserve">The dataset consisted of 2,255 cases of invasive cutaneous malignant melanoma from the Veneto Cancer Registry, covering diagnoses in 2015 and 2017. The target variable was status — a binary outcome recording whether the patient was alive or deceased </w:t>
+      </w:r>
+      <w:r>
+        <w:t>on</w:t>
+      </w:r>
+      <w:r>
+        <w:t xml:space="preserve"> 31 December 2020</w:t>
+      </w:r>
+      <w:r>
+        <w:t xml:space="preserve">. </w:t>
+      </w:r>
+    </w:p>
+    <w:p>
+      <w:r>
+        <w:t xml:space="preserve">Analysis was conducted </w:t>
+      </w:r>
+      <w:r>
+        <w:t xml:space="preserve">using the </w:t>
       </w:r>
       <w:proofErr w:type="spellStart"/>
       <w:r>
@@ -106,18 +127,28 @@
       </w:r>
       <w:proofErr w:type="spellEnd"/>
       <w:r>
-        <w:t xml:space="preserve"> model that is part of the </w:t>
-      </w:r>
-      <w:proofErr w:type="spellStart"/>
-      <w:r>
-        <w:t>Scikitlearn</w:t>
-      </w:r>
-      <w:proofErr w:type="spellEnd"/>
-      <w:r>
-        <w:t>. Through research online various the model was run a further twice more to improve the discrepancy between predicting survivability and death</w:t>
-      </w:r>
-      <w:r>
-        <w:t xml:space="preserve"> by tweaking input parameters to the model. These tweaks were based on references to the scikit learning website</w:t>
+        <w:t xml:space="preserve"> model that is part of </w:t>
+      </w:r>
+      <w:r>
+        <w:t>scikit-</w:t>
+      </w:r>
+      <w:r>
+        <w:t xml:space="preserve">learn. </w:t>
+      </w:r>
+      <w:r>
+        <w:t>The model was subsequently re-run on two further occasions, with parameters adjusted iteratively based on published guidance</w:t>
+      </w:r>
+      <w:r>
+        <w:t xml:space="preserve"> </w:t>
+      </w:r>
+      <w:r>
+        <w:t xml:space="preserve">to improve the discrepancy between predicting survivability and </w:t>
+      </w:r>
+      <w:r>
+        <w:t>predicting death</w:t>
+      </w:r>
+      <w:r>
+        <w:t>. These tweaks were based on references to the scikit learning website</w:t>
       </w:r>
       <w:sdt>
         <w:sdtPr>
@@ -227,7 +258,13 @@
     </w:p>
     <w:p>
       <w:r>
-        <w:t xml:space="preserve">The first run gave a very high (and misleading) </w:t>
+        <w:t xml:space="preserve">The first </w:t>
+      </w:r>
+      <w:r>
+        <w:t>results</w:t>
+      </w:r>
+      <w:r>
+        <w:t xml:space="preserve"> gave a very high (and misleading) </w:t>
       </w:r>
       <w:r>
         <w:t>recall</w:t>
@@ -251,7 +288,15 @@
         <w:t xml:space="preserve"> (49%)</w:t>
       </w:r>
       <w:r>
-        <w:t xml:space="preserve">. In medical research missed deaths are the most concerning given that can lead to conclusions inferring a treatment path or prediction is safer than it </w:t>
+        <w:t xml:space="preserve">. </w:t>
+      </w:r>
+      <w:r>
+        <w:t xml:space="preserve">This was from the model trained on unweighted and unscaled data. </w:t>
+      </w:r>
+    </w:p>
+    <w:p>
+      <w:r>
+        <w:t xml:space="preserve">In medical research missed deaths are the most concerning given that can lead to conclusions inferring a treatment path or prediction is safer than it </w:t>
       </w:r>
       <w:r>
         <w:t>is</w:t>
@@ -260,7 +305,11 @@
         <w:t>.</w:t>
       </w:r>
       <w:r>
-        <w:t xml:space="preserve"> Iterations of tweaking the model to </w:t>
+        <w:t xml:space="preserve"> Iterations of </w:t>
+      </w:r>
+      <w:r>
+        <w:lastRenderedPageBreak/>
+        <w:t xml:space="preserve">tweaking the model to </w:t>
       </w:r>
       <w:r>
         <w:t xml:space="preserve">use weights to allow the model to allow for the imbalance between survived and deceased events in the data, </w:t>
@@ -274,10 +323,6 @@
         <w:t xml:space="preserve"> to normalize the data (i.e. feature scale) resulted in a more creditable recall score of 78% correctly predicted survived and 88% correctly predicted deceased.</w:t>
       </w:r>
     </w:p>
-    <w:p/>
-    <w:p/>
-    <w:p/>
-    <w:p/>
     <w:p/>
     <w:p>
       <w:pPr>
@@ -1147,7 +1192,6 @@
   <w:style w:type="character" w:default="1" w:styleId="DefaultParagraphFont">
     <w:name w:val="Default Paragraph Font"/>
     <w:uiPriority w:val="1"/>
-    <w:semiHidden/>
     <w:unhideWhenUsed/>
   </w:style>
   <w:style w:type="table" w:default="1" w:styleId="TableNormal">

</xml_diff>

<commit_message>
Further corrections to the write up
</commit_message>
<xml_diff>
--- a/Predicting Melanoma Patient Survival Outcomes Using Logistic Regression - Notebook Writeup.docx
+++ b/Predicting Melanoma Patient Survival Outcomes Using Logistic Regression - Notebook Writeup.docx
@@ -35,7 +35,13 @@
         <w:t xml:space="preserve">This document is </w:t>
       </w:r>
       <w:r>
-        <w:t xml:space="preserve">intended to compliment </w:t>
+        <w:t>intended to compl</w:t>
+      </w:r>
+      <w:r>
+        <w:t>e</w:t>
+      </w:r>
+      <w:r>
+        <w:t xml:space="preserve">ment </w:t>
       </w:r>
       <w:r>
         <w:t>the annotations provided in the notebook.</w:t>
@@ -82,7 +88,13 @@
     </w:p>
     <w:p>
       <w:r>
-        <w:t xml:space="preserve">Data is from the Vento </w:t>
+        <w:t>Data is from the Ven</w:t>
+      </w:r>
+      <w:r>
+        <w:t>e</w:t>
+      </w:r>
+      <w:r>
+        <w:t xml:space="preserve">to </w:t>
       </w:r>
       <w:r>
         <w:t>Tumour</w:t>
@@ -334,7 +346,7 @@
     </w:p>
     <w:p>
       <w:r>
-        <w:t>Although it was possible to use logistical regression to model with a fair degree of accuracy to</w:t>
+        <w:t>Although it was possible to use logistic regression to model with a degree of accuracy to</w:t>
       </w:r>
       <w:r>
         <w:t xml:space="preserve"> predic</w:t>
@@ -524,7 +536,7 @@
         <w:rPr>
           <w:noProof/>
         </w:rPr>
-        <w:t>Birmingham: Pack.</w:t>
+        <w:t>Birmingham: Packt.</w:t>
       </w:r>
     </w:p>
     <w:p>
@@ -1192,6 +1204,7 @@
   <w:style w:type="character" w:default="1" w:styleId="DefaultParagraphFont">
     <w:name w:val="Default Paragraph Font"/>
     <w:uiPriority w:val="1"/>
+    <w:semiHidden/>
     <w:unhideWhenUsed/>
   </w:style>
   <w:style w:type="table" w:default="1" w:styleId="TableNormal">
@@ -1832,26 +1845,6 @@
 <file path=customXml/item1.xml><?xml version="1.0" encoding="utf-8"?>
 <b:Sources xmlns:b="http://schemas.openxmlformats.org/officeDocument/2006/bibliography" xmlns="http://schemas.openxmlformats.org/officeDocument/2006/bibliography" SelectedStyle="\HarvardAnglia2008OfficeOnline.xsl" StyleName="Harvard - Anglia" Version="2008">
   <b:Source>
-    <b:Tag>Joh25</b:Tag>
-    <b:SourceType>Book</b:SourceType>
-    <b:Guid>{CED81AF3-095D-4415-9A6D-720A0453B73B}</b:Guid>
-    <b:Author>
-      <b:Author>
-        <b:NameList>
-          <b:Person>
-            <b:Last>Sukup</b:Last>
-            <b:First>John</b:First>
-          </b:Person>
-        </b:NameList>
-      </b:Author>
-    </b:Author>
-    <b:Title>scikit-learn Cookbook</b:Title>
-    <b:Year>2025</b:Year>
-    <b:City>Birmingham</b:City>
-    <b:Publisher>Pack</b:Publisher>
-    <b:RefOrder>2</b:RefOrder>
-  </b:Source>
-  <b:Source>
     <b:Tag>sci25</b:Tag>
     <b:SourceType>InternetSite</b:SourceType>
     <b:Guid>{7238B98F-CB54-426B-A56A-C6E24887C6DE}</b:Guid>
@@ -1905,11 +1898,31 @@
     <b:URL>https://en.wikipedia.org/wiki/Proportional_hazards_model</b:URL>
     <b:RefOrder>4</b:RefOrder>
   </b:Source>
+  <b:Source>
+    <b:Tag>Joh25</b:Tag>
+    <b:SourceType>Book</b:SourceType>
+    <b:Guid>{BDC04A5F-0EEA-44DC-BBA1-750957F313FA}</b:Guid>
+    <b:Author>
+      <b:Author>
+        <b:NameList>
+          <b:Person>
+            <b:Last>Sukup</b:Last>
+            <b:First>John</b:First>
+          </b:Person>
+        </b:NameList>
+      </b:Author>
+    </b:Author>
+    <b:Title>scikit-learn Cookbook</b:Title>
+    <b:Year>2025</b:Year>
+    <b:City>Birmingham</b:City>
+    <b:Publisher>Packt</b:Publisher>
+    <b:RefOrder>2</b:RefOrder>
+  </b:Source>
 </b:Sources>
 </file>
 
 <file path=customXml/itemProps1.xml><?xml version="1.0" encoding="utf-8"?>
-<ds:datastoreItem xmlns:ds="http://schemas.openxmlformats.org/officeDocument/2006/customXml" ds:itemID="{3036D837-114F-4279-98C3-76035EBA48A9}">
+<ds:datastoreItem xmlns:ds="http://schemas.openxmlformats.org/officeDocument/2006/customXml" ds:itemID="{F6D4B17C-E52B-4C10-A5EE-F000C0302BFE}">
   <ds:schemaRefs>
     <ds:schemaRef ds:uri="http://schemas.openxmlformats.org/officeDocument/2006/bibliography"/>
   </ds:schemaRefs>

</xml_diff>

<commit_message>
Proof read and submitted
</commit_message>
<xml_diff>
--- a/Predicting Melanoma Patient Survival Outcomes Using Logistic Regression - Notebook Writeup.docx
+++ b/Predicting Melanoma Patient Survival Outcomes Using Logistic Regression - Notebook Writeup.docx
@@ -112,7 +112,13 @@
     </w:p>
     <w:p>
       <w:r>
-        <w:t xml:space="preserve">The dataset consisted of 2,255 cases of invasive cutaneous malignant melanoma from the Veneto Cancer Registry, covering diagnoses in 2015 and 2017. The target variable was status — a binary outcome recording whether the patient was alive or deceased </w:t>
+        <w:t>The dataset consisted of 2,255 cases of invasive cutaneous malignant melanoma from the Veneto Cancer Registry, covering diagnoses in 2015 and 2017. The target variable was status</w:t>
+      </w:r>
+      <w:r>
+        <w:t>,</w:t>
+      </w:r>
+      <w:r>
+        <w:t xml:space="preserve"> a binary outcome recording whether the patient was alive or deceased </w:t>
       </w:r>
       <w:r>
         <w:t>on</w:t>

</xml_diff>